<commit_message>
Draft_106: Conclusions setup paragraph (gap, RQs, framework, method)
</commit_message>
<xml_diff>
--- a/thesis/003_ThesisProposal_Draft_106.docx
+++ b/thesis/003_ThesisProposal_Draft_106.docx
@@ -10700,10 +10700,11 @@
       </w:pPr>
       <w:r>
         <w:rPr>
-          <w:sz w:val="22"/>
-          <w:szCs w:val="22"/>
-        </w:rPr>
-        <w:t>This study mapped how developing researchers at PSAU used English hedging resources in 60 undergraduate thesis abstracts across Agriculture, Veterinary Medicine, and Biology.</w:t>
+          <w:rFonts w:ascii="Georgia" w:hAnsi="Georgia" w:cs="Georgia" w:eastAsia="Georgia"/>
+          <w:sz w:val="22"/>
+          <w:szCs w:val="22"/>
+        </w:rPr>
+        <w:t xml:space="preserve">This study addressed a gap in the local record: no published study identified in this review had mapped how developing researchers in Agriculture, Veterinary Medicine, and Biology at PSAU manage uncertainty in English thesis abstracts. The study asked what types of hedging appear in those abstracts, how frequency varies across the three programs, what rhetorical functions the retained devices serve, and what the frequency and functional patterns suggest about epistemic stance in the ratified abstract. The work used a coding scheme adapted from Hyland’s (1998) formal types, with Epistemic Caution and Politeness/Deference as the two forms of stance change toward a proposition, and with Crompton’s (1997) restatement logic informing the Working Test. Methodologically, sixty complete English abstracts (twenty per discipline) were coded through a three-step procedure: a wide net of candidates, a claim condition with paired removal checks, and type assignment on retained hedges only.</w:t>
       </w:r>
     </w:p>
     <w:p>

</xml_diff>

<commit_message>
Draft_106: flowing Conclusions summary + bridge (From that gap)
</commit_message>
<xml_diff>
--- a/thesis/003_ThesisProposal_Draft_106.docx
+++ b/thesis/003_ThesisProposal_Draft_106.docx
@@ -10704,7 +10704,24 @@
           <w:sz w:val="22"/>
           <w:szCs w:val="22"/>
         </w:rPr>
-        <w:t xml:space="preserve">This study addressed a gap in the local record: no published study identified in this review had mapped how developing researchers in Agriculture, Veterinary Medicine, and Biology at PSAU manage uncertainty in English thesis abstracts. The study asked what types of hedging appear in those abstracts, how frequency varies across the three programs, what rhetorical functions the retained devices serve, and what the frequency and functional patterns suggest about epistemic stance in the ratified abstract. The work used a coding scheme adapted from Hyland’s (1998) formal types, with Epistemic Caution and Politeness/Deference as the two forms of stance change toward a proposition, and with Crompton’s (1997) restatement logic informing the Working Test. Methodologically, sixty complete English abstracts (twenty per discipline) were coded through a three-step procedure: a wide net of candidates, a claim condition with paired removal checks, and type assignment on retained hedges only.</w:t>
+        <w:t xml:space="preserve">This study addressed a local gap: no published study identified in this review had mapped how developing researchers in Agriculture, Veterinary Medicine, and Biology at PSAU manage uncertainty in English thesis abstracts. From that gap, the inquiry traced what types of hedging appear in those abstracts, how often they occur across the three programs, what functions the retained devices serve, and what those patterns suggest about epistemic stance in the ratified text. The analysis drew on Hyland’s (1998) formal types, treated Epistemic Caution and Politeness/Deference as the two forms of stance change toward a proposition, and used Crompton’s (1997) restatement logic to inform the Working Test. Sixty complete English abstracts, twenty per discipline, were coded through a wide net of candidates, a claim condition with paired removal checks, and type assignment on retained hedges only.</w:t>
+      </w:r>
+    </w:p>
+    <w:p>
+      <w:pPr>
+        <w:pStyle w:val="normal1"/>
+        <w:spacing w:lineRule="auto" w:line="480" w:before="0" w:after="0"/>
+        <w:ind w:firstLine="720"/>
+        <w:jc w:val="both"/>
+        <w:rPr/>
+      </w:pPr>
+      <w:r>
+        <w:rPr>
+          <w:rFonts w:ascii="Georgia" w:hAnsi="Georgia" w:cs="Georgia" w:eastAsia="Georgia"/>
+          <w:sz w:val="22"/>
+          <w:szCs w:val="22"/>
+        </w:rPr>
+        <w:t xml:space="preserve">What follows states what that design allows the study to conclude about hedging in this corpus, without restating the tabulated results.</w:t>
       </w:r>
     </w:p>
     <w:p>

</xml_diff>